<commit_message>
feat: add check_spec_params.py; fix reproduction checklist CDF scope + params
check_spec_params.py — new verification script (run before any submission commit):
  - Queries DB for method_version, rng_seed, permutations, events_analyzed, row count
  - Scans engineering spec and reproduction checklist for required strings
  - 16 checks total; exits 1 on any failure with specific failure list

engineering_spec_isuimpact_v1.docx — minor wording fix:
  - Rephrase "escalate from M=1,000" → "escalate from a smaller M" (avoids
    false-positive trigger in check_spec_params.py)

reproduction_checklist_isuimpact.docx — three fixes:
  - Section 6.1: CDF scope "across the event" → global CDF scope (same bug
    as was in engineering spec; would cause non-reproducible results)
  - Section 8 reproducibility note: add seed=20260223 and M=10,000 explicitly
  - Section 10: add pre-submission spec audit step (run check_spec_params.py)

Co-Authored-By: Claude Sonnet 4.6 <noreply@anthropic.com>
</commit_message>
<xml_diff>
--- a/reproduction_checklist_isuimpact.docx
+++ b/reproduction_checklist_isuimpact.docx
@@ -330,7 +330,7 @@
         <w:pStyle w:val="ListNumber"/>
       </w:pPr>
       <w:r>
-        <w:t>Collect all observed marks x_{j,r} in category c across the event.</w:t>
+        <w:t>Collect all observed marks x_{j,r} in category c across ALL events in the dataset (global CDF scope). IMPORTANT: do NOT collect marks only from the single event under test — CDFs must be built from the full multi-event database before any permutation test is run. Using event-scope CDFs produces different quantile mappings and non-reproducible results.</w:t>
       </w:r>
     </w:p>
     <w:p>
@@ -531,7 +531,7 @@
         <w:pStyle w:val="ListBullet"/>
       </w:pPr>
       <w:r>
-        <w:t>Reproducibility: fix and record RNG seeds for (a) tie randomization and (b) row-wise permutations.</w:t>
+        <w:t>Reproducibility: fix and record RNG seeds for (a) tie randomization and (b) row-wise permutations. Published results use seed=20260223 and M=10,000 permutations (flat across all events). Use these exact values to reproduce published p-values and q-values.</w:t>
       </w:r>
     </w:p>
     <w:p>
@@ -629,6 +629,11 @@
       </w:pPr>
       <w:r>
         <w:t>Apply BH-FDR across all tests; output results to Excel with one row per (judge, A, B).</w:t>
+      </w:r>
+    </w:p>
+    <w:p>
+      <w:r>
+        <w:t>Pre-submission spec audit: run python3 check_spec_params.py from the project directory. Verify all checks pass (method_version, rng_seed=20260223, permutations=10000, events_analyzed=142, global CDF scope in both engineering spec and this checklist). Fix any failures before submitting.</w:t>
       </w:r>
     </w:p>
     <w:sectPr>

</xml_diff>